<commit_message>
fix(docx/blank): declare common namespaces on <w:document> root
Real Word files declare the full Office namespace set (wps, wp, a, pic,
v, o, w10, ...) on <w:document>; OfficeCli's blank doc only declared
w/mc/w14. Subsequent raw-set injections referencing wps/wp/a (e.g. mc:Choice
Requires="wps" for DrawingML textboxes) failed MarkupCompatibility validation
because the prefix was not in scope at the AlternateContent element.

Mirror the LibreOffice docxexport MainXmlNamespaces() prefix set, and mark
only w14/wp14/w15 as mc:Ignorable (wps/wpg/wpi/wpc are gated by mc:Choice
fallback so they don't need it).

Regenerates examples/* docx outputs to pick up the new namespace block.
</commit_message>
<xml_diff>
--- a/examples/word/formulas.docx
+++ b/examples/word/formulas.docx
@@ -1,6 +1,6 @@
 
 <file path=word/document.xml><?xml version="1.0" encoding="utf-8"?>
-<w:document xmlns:m="http://schemas.openxmlformats.org/officeDocument/2006/math" xmlns:w="http://schemas.openxmlformats.org/wordprocessingml/2006/main" xmlns:mc="http://schemas.openxmlformats.org/markup-compatibility/2006" xmlns:w14="http://schemas.microsoft.com/office/word/2010/wordml" mc:Ignorable="w14">
+<w:document xmlns:r="http://schemas.openxmlformats.org/officeDocument/2006/relationships" xmlns:m="http://schemas.openxmlformats.org/officeDocument/2006/math" xmlns:v="urn:schemas-microsoft-com:vml" xmlns:o="urn:schemas-microsoft-com:office:office" xmlns:w10="urn:schemas-microsoft-com:office:word" xmlns:wne="http://schemas.microsoft.com/office/word/2006/wordml" xmlns:wp="http://schemas.openxmlformats.org/drawingml/2006/wordprocessingDrawing" xmlns:wp14="http://schemas.microsoft.com/office/word/2010/wordprocessingDrawing" xmlns:a="http://schemas.openxmlformats.org/drawingml/2006/main" xmlns:pic="http://schemas.openxmlformats.org/drawingml/2006/picture" xmlns:wps="http://schemas.microsoft.com/office/word/2010/wordprocessingShape" xmlns:wpg="http://schemas.microsoft.com/office/word/2010/wordprocessingGroup" xmlns:wpi="http://schemas.microsoft.com/office/word/2010/wordprocessingInk" xmlns:wpc="http://schemas.microsoft.com/office/word/2010/wordprocessingCanvas" xmlns:w15="http://schemas.microsoft.com/office/word/2012/wordml" xmlns:mc="http://schemas.openxmlformats.org/markup-compatibility/2006" xmlns:w="http://schemas.openxmlformats.org/wordprocessingml/2006/main" xmlns:w14="http://schemas.microsoft.com/office/word/2010/wordml" mc:Ignorable="w14 w15 wp14">
   <w:body>
     <w:p>
       <w:pPr>
@@ -29,7 +29,7 @@
       </w:r>
     </w:p>
     <w:p>
-      <m:oMathPara xmlns:m="http://schemas.openxmlformats.org/officeDocument/2006/math">
+      <m:oMathPara>
         <m:oMath>
           <m:r>
             <m:t xml:space="preserve">x = </m:t>
@@ -86,7 +86,7 @@
       </w:r>
     </w:p>
     <w:p>
-      <m:oMathPara xmlns:m="http://schemas.openxmlformats.org/officeDocument/2006/math">
+      <m:oMathPara>
         <m:oMath>
           <m:sSup>
             <m:e>
@@ -178,7 +178,7 @@
       </w:r>
     </w:p>
     <w:p>
-      <m:oMathPara xmlns:m="http://schemas.openxmlformats.org/officeDocument/2006/math">
+      <m:oMathPara>
         <m:oMath>
           <m:sSup>
             <m:e>
@@ -218,7 +218,7 @@
       </w:r>
     </w:p>
     <w:p>
-      <m:oMathPara xmlns:m="http://schemas.openxmlformats.org/officeDocument/2006/math">
+      <m:oMathPara>
         <m:oMath>
           <m:sSup>
             <m:e>
@@ -295,7 +295,7 @@
       </w:r>
     </w:p>
     <w:p>
-      <m:oMathPara xmlns:m="http://schemas.openxmlformats.org/officeDocument/2006/math">
+      <m:oMathPara>
         <m:oMath>
           <m:nary>
             <m:naryPr>
@@ -369,7 +369,7 @@
       </w:r>
     </w:p>
     <w:p>
-      <m:oMathPara xmlns:m="http://schemas.openxmlformats.org/officeDocument/2006/math">
+      <m:oMathPara>
         <m:oMath>
           <m:r>
             <m:t xml:space="preserve">f(x) = </m:t>
@@ -441,7 +441,7 @@
       </w:r>
     </w:p>
     <w:p>
-      <m:oMathPara xmlns:m="http://schemas.openxmlformats.org/officeDocument/2006/math">
+      <m:oMathPara>
         <m:oMath>
           <m:nary>
             <m:naryPr>
@@ -477,7 +477,7 @@
       </w:r>
     </w:p>
     <w:p>
-      <m:oMathPara xmlns:m="http://schemas.openxmlformats.org/officeDocument/2006/math">
+      <m:oMathPara>
         <m:oMath>
           <m:nary>
             <m:naryPr>
@@ -573,7 +573,7 @@
       </w:r>
     </w:p>
     <w:p>
-      <m:oMathPara xmlns:m="http://schemas.openxmlformats.org/officeDocument/2006/math">
+      <m:oMathPara>
         <m:oMath>
           <m:acc>
             <m:accPr>
@@ -664,7 +664,7 @@
       </w:r>
     </w:p>
     <w:p>
-      <m:oMathPara xmlns:m="http://schemas.openxmlformats.org/officeDocument/2006/math">
+      <m:oMathPara>
         <m:oMath>
           <m:r>
             <m:rPr>
@@ -701,7 +701,7 @@
       </w:r>
     </w:p>
     <w:p>
-      <m:oMathPara xmlns:m="http://schemas.openxmlformats.org/officeDocument/2006/math">
+      <m:oMathPara>
         <m:oMath>
           <m:r>
             <m:t xml:space="preserve">P(A|B) = </m:t>
@@ -735,7 +735,7 @@
       </w:r>
     </w:p>
     <w:p>
-      <m:oMathPara xmlns:m="http://schemas.openxmlformats.org/officeDocument/2006/math">
+      <m:oMathPara>
         <m:oMath>
           <m:r>
             <m:t xml:space="preserve">f(x) = </m:t>
@@ -831,7 +831,7 @@
       </w:r>
     </w:p>
     <w:p>
-      <m:oMathPara xmlns:m="http://schemas.openxmlformats.org/officeDocument/2006/math">
+      <m:oMathPara>
         <m:oMath>
           <m:sSup>
             <m:e>
@@ -933,7 +933,7 @@
       </w:r>
     </w:p>
     <w:p>
-      <m:oMathPara xmlns:m="http://schemas.openxmlformats.org/officeDocument/2006/math">
+      <m:oMathPara>
         <m:oMath>
           <m:r>
             <m:t xml:space="preserve">ζ</m:t>
@@ -993,7 +993,7 @@
       </w:r>
     </w:p>
     <w:p>
-      <m:oMathPara xmlns:m="http://schemas.openxmlformats.org/officeDocument/2006/math">
+      <m:oMathPara>
         <m:oMath>
           <m:r>
             <m:t xml:space="preserve">n! </m:t>
@@ -1070,7 +1070,7 @@
       </w:r>
     </w:p>
     <w:p>
-      <m:oMathPara xmlns:m="http://schemas.openxmlformats.org/officeDocument/2006/math">
+      <m:oMathPara>
         <m:oMath>
           <m:sSub>
             <m:e>
@@ -1163,7 +1163,7 @@
       </w:r>
     </w:p>
     <w:p>
-      <m:oMathPara xmlns:m="http://schemas.openxmlformats.org/officeDocument/2006/math">
+      <m:oMathPara>
         <m:oMath>
           <m:sSub>
             <m:e>
@@ -1251,7 +1251,7 @@
       </w:r>
     </w:p>
     <w:p>
-      <m:oMathPara xmlns:m="http://schemas.openxmlformats.org/officeDocument/2006/math">
+      <m:oMathPara>
         <m:oMath>
           <m:sSub>
             <m:e>
@@ -1363,7 +1363,7 @@
       </w:r>
     </w:p>
     <w:p>
-      <m:oMathPara xmlns:m="http://schemas.openxmlformats.org/officeDocument/2006/math">
+      <m:oMathPara>
         <m:oMath>
           <m:sSub>
             <m:e>
@@ -1469,7 +1469,7 @@
       </w:r>
     </w:p>
     <w:p>
-      <m:oMathPara xmlns:m="http://schemas.openxmlformats.org/officeDocument/2006/math">
+      <m:oMathPara>
         <m:oMath>
           <m:sSub>
             <m:e>
@@ -1539,7 +1539,7 @@
       </w:r>
     </w:p>
     <w:p>
-      <m:oMathPara xmlns:m="http://schemas.openxmlformats.org/officeDocument/2006/math">
+      <m:oMathPara>
         <m:oMath>
           <m:d>
             <m:dPr/>
@@ -1593,7 +1593,7 @@
       </w:r>
     </w:p>
     <w:p>
-      <m:oMathPara xmlns:m="http://schemas.openxmlformats.org/officeDocument/2006/math">
+      <m:oMathPara>
         <m:oMath>
           <m:sSup>
             <m:e>
@@ -1648,7 +1648,7 @@
       </w:r>
     </w:p>
     <w:p>
-      <m:oMathPara xmlns:m="http://schemas.openxmlformats.org/officeDocument/2006/math">
+      <m:oMathPara>
         <m:oMath>
           <m:r>
             <m:t xml:space="preserve">∇</m:t>
@@ -1687,7 +1687,7 @@
       </m:oMathPara>
     </w:p>
     <w:p>
-      <m:oMathPara xmlns:m="http://schemas.openxmlformats.org/officeDocument/2006/math">
+      <m:oMathPara>
         <m:oMath>
           <m:r>
             <m:t xml:space="preserve">∇</m:t>
@@ -1705,7 +1705,7 @@
       </m:oMathPara>
     </w:p>
     <w:p>
-      <m:oMathPara xmlns:m="http://schemas.openxmlformats.org/officeDocument/2006/math">
+      <m:oMathPara>
         <m:oMath>
           <m:r>
             <m:t xml:space="preserve">∇</m:t>
@@ -1741,7 +1741,7 @@
       </m:oMathPara>
     </w:p>
     <w:p>
-      <m:oMathPara xmlns:m="http://schemas.openxmlformats.org/officeDocument/2006/math">
+      <m:oMathPara>
         <m:oMath>
           <m:r>
             <m:t xml:space="preserve">∇</m:t>
@@ -1829,7 +1829,7 @@
       </w:r>
     </w:p>
     <w:p>
-      <m:oMathPara xmlns:m="http://schemas.openxmlformats.org/officeDocument/2006/math">
+      <m:oMathPara>
         <m:oMath>
           <m:sSub>
             <m:e>
@@ -1953,7 +1953,7 @@
       </w:r>
     </w:p>
     <w:p>
-      <m:oMathPara xmlns:m="http://schemas.openxmlformats.org/officeDocument/2006/math">
+      <m:oMathPara>
         <m:oMath>
           <m:r>
             <m:t xml:space="preserve">i</m:t>
@@ -2018,7 +2018,7 @@
       </w:r>
     </w:p>
     <w:p>
-      <m:oMathPara xmlns:m="http://schemas.openxmlformats.org/officeDocument/2006/math">
+      <m:oMathPara>
         <m:oMath>
           <m:r>
             <m:t xml:space="preserve">(i</m:t>
@@ -2070,7 +2070,7 @@
       </w:r>
     </w:p>
     <w:p>
-      <m:oMathPara xmlns:m="http://schemas.openxmlformats.org/officeDocument/2006/math">
+      <m:oMathPara>
         <m:oMath>
           <m:f>
             <m:num>
@@ -2168,7 +2168,7 @@
       </w:r>
     </w:p>
     <w:p>
-      <m:oMathPara xmlns:m="http://schemas.openxmlformats.org/officeDocument/2006/math">
+      <m:oMathPara>
         <m:oMath>
           <m:r>
             <m:t xml:space="preserve">Δ</m:t>
@@ -2217,7 +2217,7 @@
       </w:r>
     </w:p>
     <w:p>
-      <m:oMathPara xmlns:m="http://schemas.openxmlformats.org/officeDocument/2006/math">
+      <m:oMathPara>
         <m:oMath>
           <m:r>
             <m:t xml:space="preserve">B(</m:t>
@@ -2329,7 +2329,7 @@
       </w:r>
     </w:p>
     <w:p>
-      <m:oMathPara xmlns:m="http://schemas.openxmlformats.org/officeDocument/2006/math">
+      <m:oMathPara>
         <m:oMath>
           <m:sSup>
             <m:e>

</xml_diff>